<commit_message>
Correção na interpretação da informação reportada sobre a API aceitar apenas um nome para o cadastro no Charter Pacientes.docx, anteriormente interpretado como um defeito.
</commit_message>
<xml_diff>
--- a/docs/charters/Charter - Pacientes.docx
+++ b/docs/charters/Charter - Pacientes.docx
@@ -53,7 +53,23 @@
           <w:rStyle w:val="oypena"/>
           <w:color w:val="808080" w:themeColor="background1" w:themeShade="80"/>
         </w:rPr>
-        <w:t>Inspirado no artigo de John Bach sobre Session-Based Test Management (2001)</w:t>
+        <w:t xml:space="preserve">Inspirado no artigo de John Bach sobre </w:t>
+      </w:r>
+      <w:proofErr w:type="spellStart"/>
+      <w:r>
+        <w:rPr>
+          <w:rStyle w:val="oypena"/>
+          <w:color w:val="808080" w:themeColor="background1" w:themeShade="80"/>
+        </w:rPr>
+        <w:t>Session-Based</w:t>
+      </w:r>
+      <w:proofErr w:type="spellEnd"/>
+      <w:r>
+        <w:rPr>
+          <w:rStyle w:val="oypena"/>
+          <w:color w:val="808080" w:themeColor="background1" w:themeShade="80"/>
+        </w:rPr>
+        <w:t xml:space="preserve"> Test Management (2001)</w:t>
       </w:r>
     </w:p>
     <w:p>
@@ -235,7 +251,39 @@
           <w:i/>
           <w:iCs/>
         </w:rPr>
-        <w:t xml:space="preserve"> Swagger/Postman, banco reiniciado, heurísticas de strings, </w:t>
+        <w:t xml:space="preserve"> Swagger/</w:t>
+      </w:r>
+      <w:proofErr w:type="spellStart"/>
+      <w:r>
+        <w:rPr>
+          <w:i/>
+          <w:iCs/>
+        </w:rPr>
+        <w:t>Postman</w:t>
+      </w:r>
+      <w:proofErr w:type="spellEnd"/>
+      <w:r>
+        <w:rPr>
+          <w:i/>
+          <w:iCs/>
+        </w:rPr>
+        <w:t xml:space="preserve">, banco reiniciado, heurísticas de </w:t>
+      </w:r>
+      <w:proofErr w:type="spellStart"/>
+      <w:r>
+        <w:rPr>
+          <w:i/>
+          <w:iCs/>
+        </w:rPr>
+        <w:t>strings</w:t>
+      </w:r>
+      <w:proofErr w:type="spellEnd"/>
+      <w:r>
+        <w:rPr>
+          <w:i/>
+          <w:iCs/>
+        </w:rPr>
+        <w:t xml:space="preserve">, </w:t>
       </w:r>
       <w:r>
         <w:rPr>
@@ -482,7 +530,15 @@
         </w:rPr>
       </w:pPr>
       <w:r>
-        <w:t>(I) Cadastro de um telefone enviado como número, em vez de string, foi rejeitado com o status 400.</w:t>
+        <w:t xml:space="preserve">(I) Cadastro de um telefone enviado como número, em vez de </w:t>
+      </w:r>
+      <w:proofErr w:type="spellStart"/>
+      <w:r>
+        <w:t>string</w:t>
+      </w:r>
+      <w:proofErr w:type="spellEnd"/>
+      <w:r>
+        <w:t>, foi rejeitado com o status 400.</w:t>
       </w:r>
     </w:p>
     <w:p>
@@ -592,7 +648,27 @@
           <w:sz w:val="21"/>
           <w:szCs w:val="21"/>
         </w:rPr>
-        <w:t>(*) Podem ser (I)nformações ou (R)iscos.</w:t>
+        <w:t>(*) Podem ser (I)</w:t>
+      </w:r>
+      <w:proofErr w:type="spellStart"/>
+      <w:r>
+        <w:rPr>
+          <w:i/>
+          <w:iCs/>
+          <w:sz w:val="21"/>
+          <w:szCs w:val="21"/>
+        </w:rPr>
+        <w:t>nformações</w:t>
+      </w:r>
+      <w:proofErr w:type="spellEnd"/>
+      <w:r>
+        <w:rPr>
+          <w:i/>
+          <w:iCs/>
+          <w:sz w:val="21"/>
+          <w:szCs w:val="21"/>
+        </w:rPr>
+        <w:t xml:space="preserve"> ou (R)iscos.</w:t>
       </w:r>
     </w:p>
     <w:p>
@@ -633,8 +709,13 @@
         <w:t>o</w:t>
       </w:r>
       <w:r>
-        <w:t xml:space="preserve"> telefone e nome somente com hífens</w:t>
-      </w:r>
+        <w:t xml:space="preserve"> telefone e nome somente com </w:t>
+      </w:r>
+      <w:proofErr w:type="spellStart"/>
+      <w:r>
+        <w:t>hífens</w:t>
+      </w:r>
+      <w:proofErr w:type="spellEnd"/>
       <w:r>
         <w:t xml:space="preserve"> e/ou parênteses</w:t>
       </w:r>
@@ -642,54 +723,20 @@
         <w:t>.</w:t>
       </w:r>
     </w:p>
-    <w:p>
-      <w:pPr>
-        <w:pStyle w:val="PargrafodaLista"/>
-        <w:numPr>
-          <w:ilvl w:val="0"/>
-          <w:numId w:val="3"/>
-        </w:numPr>
-      </w:pPr>
-      <w:r>
+    <w:p/>
+    <w:p>
+      <w:pPr>
+        <w:rPr>
+          <w:b/>
+          <w:bCs/>
+        </w:rPr>
+      </w:pPr>
+      <w:r>
+        <w:rPr>
+          <w:b/>
+          <w:bCs/>
+        </w:rPr>
         <w:lastRenderedPageBreak/>
-        <w:t>A API aceitou o cadastro do nome “Ana”, que não é um nome completo visto que o campo exige um nome completo</w:t>
-      </w:r>
-    </w:p>
-    <w:p>
-      <w:pPr>
-        <w:pStyle w:val="PargrafodaLista"/>
-        <w:numPr>
-          <w:ilvl w:val="0"/>
-          <w:numId w:val="3"/>
-        </w:numPr>
-      </w:pPr>
-      <w:r>
-        <w:t xml:space="preserve">A API aceitou o cadastro do </w:t>
-      </w:r>
-      <w:r>
-        <w:t xml:space="preserve">nome e telefone somente com </w:t>
-      </w:r>
-    </w:p>
-    <w:p>
-      <w:pPr>
-        <w:rPr>
-          <w:b/>
-          <w:bCs/>
-        </w:rPr>
-      </w:pPr>
-    </w:p>
-    <w:p>
-      <w:pPr>
-        <w:rPr>
-          <w:b/>
-          <w:bCs/>
-        </w:rPr>
-      </w:pPr>
-      <w:r>
-        <w:rPr>
-          <w:b/>
-          <w:bCs/>
-        </w:rPr>
         <w:t>Perguntas:</w:t>
       </w:r>
     </w:p>
@@ -757,6 +804,40 @@
       </w:pPr>
       <w:r>
         <w:t>A API deveria permitir o cadastro de nomes com números?</w:t>
+      </w:r>
+    </w:p>
+    <w:p>
+      <w:pPr>
+        <w:pStyle w:val="PargrafodaLista"/>
+        <w:numPr>
+          <w:ilvl w:val="0"/>
+          <w:numId w:val="2"/>
+        </w:numPr>
+      </w:pPr>
+      <w:r>
+        <w:t xml:space="preserve">O campo </w:t>
+      </w:r>
+      <w:r>
+        <w:t>“</w:t>
+      </w:r>
+      <w:proofErr w:type="spellStart"/>
+      <w:r>
+        <w:rPr>
+          <w:rStyle w:val="CdigoHTML"/>
+          <w:rFonts w:eastAsiaTheme="majorEastAsia"/>
+        </w:rPr>
+        <w:t>fullName</w:t>
+      </w:r>
+      <w:proofErr w:type="spellEnd"/>
+      <w:r>
+        <w:rPr>
+          <w:rStyle w:val="CdigoHTML"/>
+          <w:rFonts w:eastAsiaTheme="majorEastAsia"/>
+        </w:rPr>
+        <w:t>”</w:t>
+      </w:r>
+      <w:r>
+        <w:t xml:space="preserve"> deve exigir nome e sobrenome ou permitir nomes legalmente formados por uma única palavra?</w:t>
       </w:r>
     </w:p>
     <w:sectPr>
@@ -2221,6 +2302,19 @@
       </w:tblBorders>
     </w:tblPr>
   </w:style>
+  <w:style w:type="character" w:styleId="CdigoHTML">
+    <w:name w:val="HTML Code"/>
+    <w:basedOn w:val="Fontepargpadro"/>
+    <w:uiPriority w:val="99"/>
+    <w:semiHidden/>
+    <w:unhideWhenUsed/>
+    <w:rsid w:val="00CE5E60"/>
+    <w:rPr>
+      <w:rFonts w:ascii="Courier New" w:eastAsia="Times New Roman" w:hAnsi="Courier New" w:cs="Courier New"/>
+      <w:sz w:val="20"/>
+      <w:szCs w:val="20"/>
+    </w:rPr>
+  </w:style>
 </w:styles>
 </file>
 

</xml_diff>